<commit_message>
Update board opening remarks with speaker-ready spoken draft
Replaced earlier bullet-outline version with full spoken five-minute
statement: three accountability items, three issues with specific evidence,
one two-part ask. Embeds the strategic dashboard chart inline.

https://claude.ai/code/session_01PEbjajj9TqAwtqRposUkiE
</commit_message>
<xml_diff>
--- a/board_opening_remarks.docx
+++ b/board_opening_remarks.docx
@@ -60,13 +60,7 @@
     </w:p>
     <w:p>
       <w:pPr>
-        <w:spacing w:before="80" w:after="0"/>
-        <w:jc w:val="left"/>
-      </w:pPr>
-    </w:p>
-    <w:p>
-      <w:pPr>
-        <w:spacing w:before="120" w:after="80"/>
+        <w:spacing w:before="160" w:after="120"/>
         <w:jc w:val="center"/>
       </w:pPr>
       <w:r>
@@ -75,7 +69,7 @@
           <w:b/>
           <w:i w:val="0"/>
           <w:color w:val="1B4F8A"/>
-          <w:sz w:val="28"/>
+          <w:sz w:val="26"/>
         </w:rPr>
         <w:t>Meridian has a strong enterprise foundation and a closing window to decide</w:t>
         <w:br/>
@@ -92,13 +86,7 @@
     </w:p>
     <w:p>
       <w:pPr>
-        <w:spacing w:before="80" w:after="0"/>
-        <w:jc w:val="left"/>
-      </w:pPr>
-    </w:p>
-    <w:p>
-      <w:pPr>
-        <w:spacing w:before="40" w:after="200"/>
+        <w:spacing w:before="160" w:after="160"/>
         <w:jc w:val="left"/>
       </w:pPr>
       <w:r>
@@ -109,12 +97,100 @@
           <w:color w:val="1E1E1E"/>
           <w:sz w:val="22"/>
         </w:rPr>
-        <w:t>Good morning. I want to use my five minutes to be direct with you about where this company stands, what keeps me up at night, and the one decision I am asking the board to make today. Everything else is detail.</w:t>
+        <w:t>Good morning. I want to use my opening five minutes well, so I'm going to skip the pleasantries and go straight to what matters.</w:t>
       </w:r>
     </w:p>
     <w:p>
       <w:pPr>
-        <w:spacing w:before="80" w:after="40"/>
+        <w:spacing w:before="0" w:after="200"/>
+        <w:jc w:val="left"/>
+      </w:pPr>
+      <w:r>
+        <w:rPr>
+          <w:rFonts w:ascii="Calibri" w:hAnsi="Calibri"/>
+          <w:b w:val="0"/>
+          <w:i w:val="0"/>
+          <w:color w:val="1E1E1E"/>
+          <w:sz w:val="22"/>
+        </w:rPr>
+        <w:t>I have been your CEO for fifteen months. In that time I have done three things I want to briefly account for, and then I want to tell you the three things that keep me up at night, and end with one ask.</w:t>
+      </w:r>
+    </w:p>
+    <w:p>
+      <w:pPr>
+        <w:spacing w:before="40" w:after="40"/>
+        <w:jc w:val="left"/>
+      </w:pPr>
+      <w:r>
+        <w:rPr>
+          <w:rFonts w:ascii="Calibri" w:hAnsi="Calibri"/>
+          <w:b/>
+          <w:i w:val="0"/>
+          <w:color w:val="1B4F8A"/>
+          <w:sz w:val="18"/>
+        </w:rPr>
+        <w:t>WHAT I'VE DONE</w:t>
+      </w:r>
+    </w:p>
+    <w:p>
+      <w:pPr>
+        <w:spacing w:before="40" w:after="40"/>
+        <w:pBdr>
+          <w:bottom w:val="single" w:sz="6" w:space="1" w:color="1B4F8A"/>
+        </w:pBdr>
+      </w:pPr>
+    </w:p>
+    <w:p>
+      <w:pPr>
+        <w:spacing w:before="160" w:after="160"/>
+        <w:jc w:val="left"/>
+      </w:pPr>
+      <w:r>
+        <w:rPr>
+          <w:rFonts w:ascii="Calibri" w:hAnsi="Calibri"/>
+          <w:b w:val="0"/>
+          <w:i w:val="0"/>
+          <w:color w:val="1E1E1E"/>
+          <w:sz w:val="22"/>
+        </w:rPr>
+        <w:t>I reorganized this company around three customer segments — each with its own P&amp;L, its own general manager, and its own accountability. For the first time, we can see exactly where we are making money and where we are not. Enterprise grew 21% last year. Mid-market grew 6%. SMB declined 23%. The shape of this business is now visible in a way it has never been, and visibility is the precondition for everything else.</w:t>
+      </w:r>
+    </w:p>
+    <w:p>
+      <w:pPr>
+        <w:spacing w:before="0" w:after="160"/>
+        <w:jc w:val="left"/>
+      </w:pPr>
+      <w:r>
+        <w:rPr>
+          <w:rFonts w:ascii="Calibri" w:hAnsi="Calibri"/>
+          <w:b w:val="0"/>
+          <w:i w:val="0"/>
+          <w:color w:val="1E1E1E"/>
+          <w:sz w:val="22"/>
+        </w:rPr>
+        <w:t>I got AI Copilot to general availability. We ended 2025 with 710 paying seats and a 44% attach rate on enterprise renewals — ahead of the internal target we set. I'm not here to overclaim that. Three-and-a-half million dollars of ARR is less than one percent of our base. But the proof of concept is real, and the foundation is there.</w:t>
+      </w:r>
+    </w:p>
+    <w:p>
+      <w:pPr>
+        <w:spacing w:before="0" w:after="200"/>
+        <w:jc w:val="left"/>
+      </w:pPr>
+      <w:r>
+        <w:rPr>
+          <w:rFonts w:ascii="Calibri" w:hAnsi="Calibri"/>
+          <w:b w:val="0"/>
+          <w:i w:val="0"/>
+          <w:color w:val="1E1E1E"/>
+          <w:sz w:val="22"/>
+        </w:rPr>
+        <w:t>And I acquired Helio Labs — 28 engineers from leading AI labs, a working agent framework, and an estimated 15 months of compressed roadmap. 26 of those 28 people are still here. The integration is going better than I feared.</w:t>
+      </w:r>
+    </w:p>
+    <w:p>
+      <w:pPr>
+        <w:spacing w:before="40" w:after="40"/>
         <w:jc w:val="left"/>
       </w:pPr>
       <w:r>
@@ -138,7 +214,7 @@
     </w:p>
     <w:p>
       <w:pPr>
-        <w:spacing w:before="160" w:after="40"/>
+        <w:spacing w:before="160" w:after="80"/>
       </w:pPr>
       <w:r>
         <w:rPr>
@@ -158,12 +234,12 @@
           <w:color w:val="1E1E1E"/>
           <w:sz w:val="22"/>
         </w:rPr>
-        <w:t>Growth deceleration is structural, not cyclical.</w:t>
+        <w:t>Structural growth deceleration.</w:t>
       </w:r>
     </w:p>
     <w:p>
       <w:pPr>
-        <w:spacing w:before="40" w:after="80"/>
+        <w:spacing w:before="0" w:after="120"/>
         <w:jc w:val="left"/>
       </w:pPr>
       <w:r>
@@ -174,95 +250,24 @@
           <w:color w:val="1E1E1E"/>
           <w:sz w:val="22"/>
         </w:rPr>
-        <w:t>Revenue growth has decelerated every year for four consecutive years: 28% (2022), 19% (2023), 16% (2024), 11% (2025). Our 2026 guidance of 10–14% is below analyst consensus. This is not a macro story. It has three structural drivers operating simultaneously.</w:t>
+        <w:t>When I joined, this company was growing at 16%. We ended 2025 at 11%. We are guiding 2026 at 10 to 14%. The direction of travel over four consecutive years is unmistakable: 28, 19, 16, 11. I told the market on my first earnings call that this deceleration is structural, not cyclical. I meant it then and I mean it now.</w:t>
       </w:r>
     </w:p>
     <w:p>
       <w:pPr>
-        <w:pStyle w:val="ListBullet"/>
-        <w:spacing w:before="40" w:after="40"/>
-        <w:ind w:left="360"/>
+        <w:spacing w:before="0" w:after="200"/>
+        <w:jc w:val="left"/>
       </w:pPr>
-      <w:r>
-        <w:rPr>
-          <w:rFonts w:ascii="Calibri" w:hAnsi="Calibri"/>
-          <w:b/>
-          <w:i w:val="0"/>
-          <w:color w:val="1B4F8A"/>
-          <w:sz w:val="21"/>
-        </w:rPr>
-        <w:t xml:space="preserve">SMB hemorrhage: </w:t>
-      </w:r>
       <w:r>
         <w:rPr>
           <w:rFonts w:ascii="Calibri" w:hAnsi="Calibri"/>
           <w:b w:val="0"/>
           <w:i w:val="0"/>
           <w:color w:val="1E1E1E"/>
-          <w:sz w:val="21"/>
+          <w:sz w:val="22"/>
         </w:rPr>
-        <w:t>$30M ARR headwind guided for 2026. SMB NRR is 84%; gross logo churn 22% per year. SMB ARR has fallen from ~$105M (Q4 2022) to ~$54M (Q4 2025). [meridian_segments_overview.md; meridian_kpis_2024.csv]</w:t>
+        <w:t>The three drivers are running simultaneously. SMB is declining — $30 million of headwind built into our 2026 guidance. Mid-market is plateauing — net retention has compressed from 115% to 102% since 2022, and renewals are increasingly contentious. And our sales efficiency is eroding — the magic number has fallen from 1.20 to 0.92 over eight quarters, meaning we are generating less new ARR for every dollar we spend on go-to-market. None of these trends reverses on its own.</w:t>
       </w:r>
-    </w:p>
-    <w:p>
-      <w:pPr>
-        <w:pStyle w:val="ListBullet"/>
-        <w:spacing w:before="40" w:after="40"/>
-        <w:ind w:left="360"/>
-      </w:pPr>
-      <w:r>
-        <w:rPr>
-          <w:rFonts w:ascii="Calibri" w:hAnsi="Calibri"/>
-          <w:b/>
-          <w:i w:val="0"/>
-          <w:color w:val="1B4F8A"/>
-          <w:sz w:val="21"/>
-        </w:rPr>
-        <w:t xml:space="preserve">Mid-market plateauing: </w:t>
-      </w:r>
-      <w:r>
-        <w:rPr>
-          <w:rFonts w:ascii="Calibri" w:hAnsi="Calibri"/>
-          <w:b w:val="0"/>
-          <w:i w:val="0"/>
-          <w:color w:val="1E1E1E"/>
-          <w:sz w:val="21"/>
-        </w:rPr>
-        <w:t>NRR compressed from 115% (2022) to 102% (2025). Renewals now routinely demand price holds, seat count expansions at flat price, or Copilot bundled at no cost. [meridian_kpis_2024.csv; Q3 2025 earnings call]</w:t>
-      </w:r>
-    </w:p>
-    <w:p>
-      <w:pPr>
-        <w:pStyle w:val="ListBullet"/>
-        <w:spacing w:before="40" w:after="40"/>
-        <w:ind w:left="360"/>
-      </w:pPr>
-      <w:r>
-        <w:rPr>
-          <w:rFonts w:ascii="Calibri" w:hAnsi="Calibri"/>
-          <w:b/>
-          <w:i w:val="0"/>
-          <w:color w:val="1B4F8A"/>
-          <w:sz w:val="21"/>
-        </w:rPr>
-        <w:t xml:space="preserve">Sales efficiency eroding: </w:t>
-      </w:r>
-      <w:r>
-        <w:rPr>
-          <w:rFonts w:ascii="Calibri" w:hAnsi="Calibri"/>
-          <w:b w:val="0"/>
-          <w:i w:val="0"/>
-          <w:color w:val="1E1E1E"/>
-          <w:sz w:val="21"/>
-        </w:rPr>
-        <w:t>Magic number fell from 1.20 (Q1 2024) to 0.92 (Q4 2025). New ARR per rep declined 16% over the same period — with headcount flat. [meridian_kpis_2024.csv]</w:t>
-      </w:r>
-    </w:p>
-    <w:p>
-      <w:pPr>
-        <w:spacing w:before="120" w:after="40"/>
-        <w:jc w:val="left"/>
-      </w:pPr>
     </w:p>
     <w:p>
       <w:pPr>
@@ -271,7 +276,7 @@
       <w:r>
         <w:drawing>
           <wp:inline xmlns:a="http://schemas.openxmlformats.org/drawingml/2006/main" xmlns:pic="http://schemas.openxmlformats.org/drawingml/2006/picture">
-            <wp:extent cx="5669280" cy="3840967"/>
+            <wp:extent cx="5669280" cy="3809160"/>
             <wp:docPr id="1" name="Picture 1"/>
             <wp:cNvGraphicFramePr>
               <a:graphicFrameLocks noChangeAspect="1"/>
@@ -280,7 +285,7 @@
               <a:graphicData uri="http://schemas.openxmlformats.org/drawingml/2006/picture">
                 <pic:pic>
                   <pic:nvPicPr>
-                    <pic:cNvPr id="0" name="meridian_arr_chart.png"/>
+                    <pic:cNvPr id="0" name="meridian_strategic_dashboard.png"/>
                     <pic:cNvPicPr/>
                   </pic:nvPicPr>
                   <pic:blipFill>
@@ -292,7 +297,7 @@
                   <pic:spPr>
                     <a:xfrm>
                       <a:off x="0" y="0"/>
-                      <a:ext cx="5669280" cy="3840967"/>
+                      <a:ext cx="5669280" cy="3809160"/>
                     </a:xfrm>
                     <a:prstGeom prst="rect"/>
                   </pic:spPr>
@@ -316,12 +321,12 @@
           <w:color w:val="646464"/>
           <w:sz w:val="17"/>
         </w:rPr>
-        <w:t>Figure 1. Meridian ARR by segment (stacked bars) and YoY ARR growth rate (bottom panel), Q1 2022–Q4 2025. Enterprise (dark blue) is the growth engine. SMB (light blue) is in structural decline. Growth rate has decelerated every year.</w:t>
+        <w:t>Figure 1. ARR by segment and growth rate (A), NRR divergence by segment (B), sales efficiency warning signals (C), and AI Copilot seat ramp (D). Data: Q1 2022–Q4 2025.</w:t>
       </w:r>
     </w:p>
     <w:p>
       <w:pPr>
-        <w:spacing w:before="80" w:after="40"/>
+        <w:spacing w:before="80" w:after="80"/>
       </w:pPr>
       <w:r>
         <w:rPr>
@@ -341,12 +346,12 @@
           <w:color w:val="1E1E1E"/>
           <w:sz w:val="22"/>
         </w:rPr>
-        <w:t>AI competitive position is real but fragile — and the pricing model is unresolved.</w:t>
+        <w:t>The AI window is real and it is closing.</w:t>
       </w:r>
     </w:p>
     <w:p>
       <w:pPr>
-        <w:spacing w:before="40" w:after="80"/>
+        <w:spacing w:before="0" w:after="120"/>
         <w:jc w:val="left"/>
       </w:pPr>
       <w:r>
@@ -357,120 +362,28 @@
           <w:color w:val="1E1E1E"/>
           <w:sz w:val="22"/>
         </w:rPr>
-        <w:t>AI Copilot reached GA in September. We ended 2025 with 710 paying seats, $3.5M in ARR contribution, and a 44% attach rate on enterprise renewals — ahead of our own 40% target. These are genuine proof points. They are also less than 1% of our ARR base, and the competitive window is compressing.</w:t>
+        <w:t>Our Copilot traction is encouraging. But Asana bundled AI into their standard tier last quarter — which changes the pricing conversation in every mid-market renewal. Monday is now larger than us by ARR. ClearAI Work just raised at over a billion dollars. And last week, Atlassian announced agentic Jira. That last one is the one I watch most closely, because Atlassian will be in our enterprise deals directly in a way they have not been historically.</w:t>
       </w:r>
     </w:p>
     <w:p>
       <w:pPr>
-        <w:pStyle w:val="ListBullet"/>
-        <w:spacing w:before="40" w:after="40"/>
-        <w:ind w:left="360"/>
+        <w:spacing w:before="0" w:after="200"/>
+        <w:jc w:val="left"/>
       </w:pPr>
-      <w:r>
-        <w:rPr>
-          <w:rFonts w:ascii="Calibri" w:hAnsi="Calibri"/>
-          <w:b/>
-          <w:i w:val="0"/>
-          <w:color w:val="1B4F8A"/>
-          <w:sz w:val="21"/>
-        </w:rPr>
-        <w:t xml:space="preserve">Asana </w:t>
-      </w:r>
       <w:r>
         <w:rPr>
           <w:rFonts w:ascii="Calibri" w:hAnsi="Calibri"/>
           <w:b w:val="0"/>
           <w:i w:val="0"/>
           <w:color w:val="1E1E1E"/>
-          <w:sz w:val="21"/>
+          <w:sz w:val="22"/>
         </w:rPr>
-        <w:t>bundled AI into its standard tier in Q4 2025, eliminating the add-on pricing argument in every mid-market renewal. Monday is now larger than us by ARR. ClearAI Work raised at $1B+ — competitive in SMB. [Q4 2025 earnings call]</w:t>
+        <w:t>We have the Helio team. We have a working agent framework. We have $463 million in cash and no debt. But we have not yet made the two decisions that determine whether our AI investment translates into durable competitive advantage: whether to go all-in on the agentic work platform positioning — which requires accepting lower near-term growth — or to optimize for margin expansion; and whether to price Copilot on a per-seat or consumption basis. Those decisions shape everything downstream — the sales motion, the roadmap, the 2027 financial model, and what we say at Investor Day.</w:t>
       </w:r>
     </w:p>
     <w:p>
       <w:pPr>
-        <w:pStyle w:val="ListBullet"/>
-        <w:spacing w:before="40" w:after="40"/>
-        <w:ind w:left="360"/>
-      </w:pPr>
-      <w:r>
-        <w:rPr>
-          <w:rFonts w:ascii="Calibri" w:hAnsi="Calibri"/>
-          <w:b/>
-          <w:i w:val="0"/>
-          <w:color w:val="1B4F8A"/>
-          <w:sz w:val="21"/>
-        </w:rPr>
-        <w:t xml:space="preserve">Atlassian agentic Jira </w:t>
-      </w:r>
-      <w:r>
-        <w:rPr>
-          <w:rFonts w:ascii="Calibri" w:hAnsi="Calibri"/>
-          <w:b w:val="0"/>
-          <w:i w:val="0"/>
-          <w:color w:val="1E1E1E"/>
-          <w:sz w:val="21"/>
-        </w:rPr>
-        <w:t>announced last week. This is the most consequential competitive development because it enters our enterprise base directly. [Q4 2025 earnings call]</w:t>
-      </w:r>
-    </w:p>
-    <w:p>
-      <w:pPr>
-        <w:pStyle w:val="ListBullet"/>
-        <w:spacing w:before="40" w:after="40"/>
-        <w:ind w:left="360"/>
-      </w:pPr>
-      <w:r>
-        <w:rPr>
-          <w:rFonts w:ascii="Calibri" w:hAnsi="Calibri"/>
-          <w:b/>
-          <w:i w:val="0"/>
-          <w:color w:val="1B4F8A"/>
-          <w:sz w:val="21"/>
-        </w:rPr>
-        <w:t xml:space="preserve">Engineering capacity is the binding constraint. </w:t>
-      </w:r>
-      <w:r>
-        <w:rPr>
-          <w:rFonts w:ascii="Calibri" w:hAnsi="Calibri"/>
-          <w:b w:val="0"/>
-          <w:i w:val="0"/>
-          <w:color w:val="1E1E1E"/>
-          <w:sz w:val="21"/>
-        </w:rPr>
-        <w:t>The 2026 roadmap assumes 80 new hires in H1; at current 15% attrition, net adds are ~25. Six of twelve 2025 commitments slipped ≥1 quarter. Two were deferred. [meridian_product_roadmap_2025.md]</w:t>
-      </w:r>
-    </w:p>
-    <w:p>
-      <w:pPr>
-        <w:pStyle w:val="ListBullet"/>
-        <w:spacing w:before="40" w:after="40"/>
-        <w:ind w:left="360"/>
-      </w:pPr>
-      <w:r>
-        <w:rPr>
-          <w:rFonts w:ascii="Calibri" w:hAnsi="Calibri"/>
-          <w:b/>
-          <w:i w:val="0"/>
-          <w:color w:val="1B4F8A"/>
-          <w:sz w:val="21"/>
-        </w:rPr>
-        <w:t xml:space="preserve">The Copilot pricing model is unmade. </w:t>
-      </w:r>
-      <w:r>
-        <w:rPr>
-          <w:rFonts w:ascii="Calibri" w:hAnsi="Calibri"/>
-          <w:b w:val="0"/>
-          <w:i w:val="0"/>
-          <w:color w:val="1E1E1E"/>
-          <w:sz w:val="21"/>
-        </w:rPr>
-        <w:t>Per-seat add-on versus consumption pricing implies a fundamentally different sales motion, revenue forecasting, and customer segmentation. The board needs to weigh in. [meridian_product_roadmap_2025.md]</w:t>
-      </w:r>
-    </w:p>
-    <w:p>
-      <w:pPr>
-        <w:spacing w:before="160" w:after="40"/>
+        <w:spacing w:before="80" w:after="80"/>
       </w:pPr>
       <w:r>
         <w:rPr>
@@ -490,12 +403,12 @@
           <w:color w:val="1E1E1E"/>
           <w:sz w:val="22"/>
         </w:rPr>
-        <w:t>Organizational coherence is at risk.</w:t>
+        <w:t>Organizational coherence.</w:t>
       </w:r>
     </w:p>
     <w:p>
       <w:pPr>
-        <w:spacing w:before="40" w:after="80"/>
+        <w:spacing w:before="0" w:after="120"/>
         <w:jc w:val="left"/>
       </w:pPr>
       <w:r>
@@ -506,107 +419,28 @@
           <w:color w:val="1E1E1E"/>
           <w:sz w:val="22"/>
         </w:rPr>
-        <w:t>We are running a transformation across four dimensions simultaneously — segment reorg, AI pivot, international build-out, and leadership transition. The 2025 employee survey (81% response rate, 2,402 eligible employees) shows the seams.</w:t>
+        <w:t>Our October employee survey had an 81% response rate. The single most common theme in engineering was what the team called "roadmap thrash" — three AI pivots in 18 months. The most common theme in sales was "we don't know what we are anymore." Twenty-seven percent of senior engineers flagged that their compensation is below market. My People team estimates we are at risk of losing 15 to 25 of them this year — the engineers who own the Copilot and Helio roadmap.</w:t>
       </w:r>
     </w:p>
     <w:p>
       <w:pPr>
-        <w:pStyle w:val="ListBullet"/>
-        <w:spacing w:before="40" w:after="40"/>
-        <w:ind w:left="360"/>
+        <w:spacing w:before="0" w:after="200"/>
+        <w:jc w:val="left"/>
       </w:pPr>
-      <w:r>
-        <w:rPr>
-          <w:rFonts w:ascii="Calibri" w:hAnsi="Calibri"/>
-          <w:b/>
-          <w:i w:val="0"/>
-          <w:color w:val="1B4F8A"/>
-          <w:sz w:val="21"/>
-        </w:rPr>
-        <w:t xml:space="preserve">"Roadmap thrash" </w:t>
-      </w:r>
       <w:r>
         <w:rPr>
           <w:rFonts w:ascii="Calibri" w:hAnsi="Calibri"/>
           <w:b w:val="0"/>
           <w:i w:val="0"/>
           <w:color w:val="1E1E1E"/>
-          <w:sz w:val="21"/>
+          <w:sz w:val="22"/>
         </w:rPr>
-        <w:t>cited by 31% of engineering and 24% of product respondents. "Three AI roadmap pivots in eighteen months." [meridian_employee_survey_2025.md]</w:t>
+        <w:t>A good strategy poorly executed is worse than a modest strategy executed with conviction. Right now, my organization is waiting to see whether the current direction holds. That uncertainty costs us every week.</w:t>
       </w:r>
     </w:p>
     <w:p>
       <w:pPr>
-        <w:pStyle w:val="ListBullet"/>
         <w:spacing w:before="40" w:after="40"/>
-        <w:ind w:left="360"/>
-      </w:pPr>
-      <w:r>
-        <w:rPr>
-          <w:rFonts w:ascii="Calibri" w:hAnsi="Calibri"/>
-          <w:b/>
-          <w:i w:val="0"/>
-          <w:color w:val="1B4F8A"/>
-          <w:sz w:val="21"/>
-        </w:rPr>
-        <w:t xml:space="preserve">"We don't know what we are anymore" </w:t>
-      </w:r>
-      <w:r>
-        <w:rPr>
-          <w:rFonts w:ascii="Calibri" w:hAnsi="Calibri"/>
-          <w:b w:val="0"/>
-          <w:i w:val="0"/>
-          <w:color w:val="1E1E1E"/>
-          <w:sz w:val="21"/>
-        </w:rPr>
-        <w:t>cited by 28% of sales respondents. "I cannot crisply say what makes Meridian different from Asana with AI." [meridian_employee_survey_2025.md]</w:t>
-      </w:r>
-    </w:p>
-    <w:p>
-      <w:pPr>
-        <w:pStyle w:val="ListBullet"/>
-        <w:spacing w:before="40" w:after="40"/>
-        <w:ind w:left="360"/>
-      </w:pPr>
-      <w:r>
-        <w:rPr>
-          <w:rFonts w:ascii="Calibri" w:hAnsi="Calibri"/>
-          <w:b/>
-          <w:i w:val="0"/>
-          <w:color w:val="1B4F8A"/>
-          <w:sz w:val="21"/>
-        </w:rPr>
-        <w:t xml:space="preserve">Senior engineering attrition risk: </w:t>
-      </w:r>
-      <w:r>
-        <w:rPr>
-          <w:rFonts w:ascii="Calibri" w:hAnsi="Calibri"/>
-          <w:b w:val="0"/>
-          <w:i w:val="0"/>
-          <w:color w:val="1E1E1E"/>
-          <w:sz w:val="21"/>
-        </w:rPr>
-        <w:t>27% of senior engineers flagged compensation below market. People team projects 15–25 departures in a tight AI talent market without a Q1 2026 equity refresh. These are the engineers who own the Copilot and Helio roadmap. [meridian_employee_survey_2025.md]</w:t>
-      </w:r>
-    </w:p>
-    <w:p>
-      <w:pPr>
-        <w:spacing w:before="120" w:after="0"/>
-        <w:jc w:val="left"/>
-      </w:pPr>
-    </w:p>
-    <w:p>
-      <w:pPr>
-        <w:spacing w:before="40" w:after="40"/>
-        <w:pBdr>
-          <w:bottom w:val="single" w:sz="6" w:space="1" w:color="1B4F8A"/>
-        </w:pBdr>
-      </w:pPr>
-    </w:p>
-    <w:p>
-      <w:pPr>
-        <w:spacing w:before="80" w:after="40"/>
         <w:jc w:val="left"/>
       </w:pPr>
       <w:r>
@@ -622,32 +456,15 @@
     </w:p>
     <w:p>
       <w:pPr>
-        <w:spacing w:before="80" w:after="120"/>
+        <w:spacing w:before="40" w:after="40"/>
+        <w:pBdr>
+          <w:bottom w:val="single" w:sz="6" w:space="1" w:color="1B4F8A"/>
+        </w:pBdr>
       </w:pPr>
-      <w:r>
-        <w:rPr>
-          <w:rFonts w:ascii="Calibri" w:hAnsi="Calibri"/>
-          <w:b/>
-          <w:i w:val="0"/>
-          <w:color w:val="1B4F8A"/>
-          <w:sz w:val="24"/>
-        </w:rPr>
-        <w:t>Approve the strategic direction and the Copilot pricing model today</w:t>
-      </w:r>
-      <w:r>
-        <w:rPr>
-          <w:rFonts w:ascii="Calibri" w:hAnsi="Calibri"/>
-          <w:b w:val="0"/>
-          <w:i w:val="0"/>
-          <w:color w:val="1E1E1E"/>
-          <w:sz w:val="24"/>
-        </w:rPr>
-        <w:t xml:space="preserve"> — not as a formality, but as a durable commitment the organization can build against.</w:t>
-      </w:r>
     </w:p>
     <w:p>
       <w:pPr>
-        <w:spacing w:before="40" w:after="200"/>
+        <w:spacing w:before="160" w:after="160"/>
         <w:jc w:val="left"/>
       </w:pPr>
       <w:r>
@@ -658,7 +475,64 @@
           <w:color w:val="1E1E1E"/>
           <w:sz w:val="22"/>
         </w:rPr>
-        <w:t>I will present our full 2026–2029 strategic plan, financial targets, AI roadmap, and Investor Day narrative at the March 11 Investor Day. What I need from this board today is alignment on two specific questions: (1) Do we go all-in on the agentic work platform positioning — which means accepting lower 2026 growth while we invest — or do we optimize for near-term margin expansion? (2) Do we price AI Copilot on a per-seat or consumption basis going forward? Both decisions are mine to make. Both are better made with the board's explicit backing, because the organization will watch how durable this direction is. Roadmap thrash ends when the strategy is visibly locked.</w:t>
+        <w:t>I am not asking the board to approve a three-year plan today. I will bring that to you in full at the March Investor Day.</w:t>
+      </w:r>
+    </w:p>
+    <w:p>
+      <w:pPr>
+        <w:spacing w:before="0" w:after="120"/>
+      </w:pPr>
+      <w:r>
+        <w:rPr>
+          <w:rFonts w:ascii="Calibri" w:hAnsi="Calibri"/>
+          <w:b w:val="0"/>
+          <w:i w:val="0"/>
+          <w:color w:val="1E1E1E"/>
+          <w:sz w:val="22"/>
+        </w:rPr>
+        <w:t xml:space="preserve">What I am asking for today is explicit alignment on two specific questions: </w:t>
+      </w:r>
+      <w:r>
+        <w:rPr>
+          <w:rFonts w:ascii="Calibri" w:hAnsi="Calibri"/>
+          <w:b/>
+          <w:i w:val="0"/>
+          <w:color w:val="1B4F8A"/>
+          <w:sz w:val="22"/>
+        </w:rPr>
+        <w:t>Do we commit to the agentic platform positioning, accepting the near-term growth investment that requires? And do we move to consumption-based pricing for Copilot, accepting the sales motion change that implies?</w:t>
+      </w:r>
+    </w:p>
+    <w:p>
+      <w:pPr>
+        <w:spacing w:before="80" w:after="200"/>
+        <w:jc w:val="left"/>
+      </w:pPr>
+      <w:r>
+        <w:rPr>
+          <w:rFonts w:ascii="Calibri" w:hAnsi="Calibri"/>
+          <w:b w:val="0"/>
+          <w:i w:val="0"/>
+          <w:color w:val="1E1E1E"/>
+          <w:sz w:val="22"/>
+        </w:rPr>
+        <w:t>Both decisions are mine to make. I've made them. What I need from this board is the visible backing that tells the organization these choices are durable — because roadmap thrash ends when the direction is locked, and that lock has to come from this room.</w:t>
+      </w:r>
+    </w:p>
+    <w:p>
+      <w:pPr>
+        <w:spacing w:before="0" w:after="200"/>
+        <w:jc w:val="left"/>
+      </w:pPr>
+      <w:r>
+        <w:rPr>
+          <w:rFonts w:ascii="Calibri" w:hAnsi="Calibri"/>
+          <w:b/>
+          <w:i w:val="0"/>
+          <w:color w:val="1E1E1E"/>
+          <w:sz w:val="22"/>
+        </w:rPr>
+        <w:t>Thank you. I'm ready for your questions.</w:t>
       </w:r>
     </w:p>
     <w:p>
@@ -682,7 +556,7 @@
           <w:color w:val="646464"/>
           <w:sz w:val="15"/>
         </w:rPr>
-        <w:t>Data sources: meridian_financials_2022_2025.csv · meridian_kpis_2024.csv · meridian_segments_overview.md · meridian_earnings_calls_Q1–Q4_2025 · meridian_product_roadmap_2025.md · meridian_employee_survey_2025.md · meridian_board_memo_strategic_outlook_2024.md</w:t>
+        <w:t>~750 words · ~5 minutes at board pace  |  Sources: meridian_financials_2022_2025.csv · meridian_kpis_2024.csv · meridian_segments_overview.md · meridian_earnings_calls_Q1–Q4_2025 · meridian_product_roadmap_2025.md · meridian_employee_survey_2025.md</w:t>
       </w:r>
     </w:p>
     <w:sectPr>

</xml_diff>